<commit_message>
docs: link al sitio publicado en GitHub Pages en el README y la carátula (#21)
Co-Authored-By: Claude Opus 5.5 <noreply@anthropic.com>
</commit_message>
<xml_diff>
--- a/docs/Sprint 2/00_Caratula_e_Indice_Sprint2_Los_Primos.docx
+++ b/docs/Sprint 2/00_Caratula_e_Indice_Sprint2_Los_Primos.docx
@@ -2028,9 +2028,30 @@
           <w:bCs/>
           <w:color w:val="333333"/>
         </w:rPr>
+        <w:t xml:space="preserve">Sitio publicado: </w:t>
+      </w:r>
+      <w:hyperlink w:history="1" r:id="rIdbycpxtecichcvyiwdn4r9">
+        <w:r>
+          <w:rPr>
+            <w:rStyle w:val="Hyperlink"/>
+          </w:rPr>
+          <w:t xml:space="preserve">https://juanimol19.github.io/mieles-los-primos-web/</w:t>
+        </w:r>
+      </w:hyperlink>
+    </w:p>
+    <w:p>
+      <w:pPr>
+        <w:spacing w:after="80"/>
+      </w:pPr>
+      <w:r>
+        <w:rPr>
+          <w:b/>
+          <w:bCs/>
+          <w:color w:val="333333"/>
+        </w:rPr>
         <w:t xml:space="preserve">Repositorio: </w:t>
       </w:r>
-      <w:hyperlink w:history="1" r:id="rIdbcu58asfqhpk1zssj9yzj">
+      <w:hyperlink w:history="1" r:id="rIdey2wow1x2eivmr9yfezup">
         <w:r>
           <w:rPr>
             <w:rStyle w:val="Hyperlink"/>
@@ -2051,7 +2072,7 @@
         </w:rPr>
         <w:t xml:space="preserve">Wiki del proyecto: </w:t>
       </w:r>
-      <w:hyperlink w:history="1" r:id="rId_qmrmmi3wra_dfopscqig">
+      <w:hyperlink w:history="1" r:id="rIdrcpnf1bfqvje3qo4kfv-2">
         <w:r>
           <w:rPr>
             <w:rStyle w:val="Hyperlink"/>
@@ -2072,7 +2093,7 @@
         </w:rPr>
         <w:t xml:space="preserve">Tablero Kanban: </w:t>
       </w:r>
-      <w:hyperlink w:history="1" r:id="rIdohozll0wrhmw2qiw95hqb">
+      <w:hyperlink w:history="1" r:id="rIdsnf4sp4alxbkvavdhfebv">
         <w:r>
           <w:rPr>
             <w:rStyle w:val="Hyperlink"/>

</xml_diff>